<commit_message>
Verify and complete reference details
Co-Authored-By: Claude Sonnet 5.5 <noreply@anthropic.com>
Claude-Session: https://claude.ai/code/session_01BZjJPdbxvnVxMrcgFoYMCh
</commit_message>
<xml_diff>
--- a/isr_submission/Manuscript_blinded.docx
+++ b/isr_submission/Manuscript_blinded.docx
@@ -13201,7 +13201,7 @@
           <w:b w:val="0"/>
           <w:i w:val="0"/>
         </w:rPr>
-        <w:t xml:space="preserve"> SWE-bench Verified (Jimenez et al. 2024; the human-validated subset released by Chowdhury et al. 2024) labels each of 500 tasks with the time a human engineer would need to fix it. Combining the labels with a published run of a reasoning model on 495 of these tasks, the agent resolved 39.9 percent of the tasks labeled under 15 minutes (</w:t>
+        <w:t xml:space="preserve"> SWE-bench Verified (Jimenez et al. 2024; the human-validated subset released by OpenAI 2024) labels each of 500 tasks with the time a human engineer would need to fix it. Combining the labels with a published run of a reasoning model on 495 of these tasks, the agent resolved 39.9 percent of the tasks labeled under 15 minutes (</w:t>
       </w:r>
       <w:r>
         <w:rPr>
@@ -13998,21 +13998,7 @@
           <w:b w:val="0"/>
           <w:i w:val="0"/>
         </w:rPr>
-        <w:t xml:space="preserve">Bauer [first initial] (2026) The last costly signal: How generative AI collapses competence signaling and why liability sustains markets for expert services. </w:t>
-      </w:r>
-      <w:r>
-        <w:rPr>
-          <w:b w:val="0"/>
-          <w:i/>
-        </w:rPr>
-        <w:t>Games</w:t>
-      </w:r>
-      <w:r>
-        <w:rPr>
-          <w:b w:val="0"/>
-          <w:i w:val="0"/>
-        </w:rPr>
-        <w:t xml:space="preserve"> 17(5):49. [Authors' given name and final bibliographic details to be verified.]</w:t>
+        <w:t>Bauer A (2026) The last costly signal: How generative AI collapses competence signaling and why liability sustains markets for expert services. Working paper, arXiv:2607.26327 (v4).</w:t>
       </w:r>
     </w:p>
     <w:p>
@@ -14025,7 +14011,7 @@
           <w:b w:val="0"/>
           <w:i w:val="0"/>
         </w:rPr>
-        <w:t>Bergemann D, Bonatti A, Smolin A (2026) Menu pricing of large language models. Working paper, arXiv:2502.07736. [Version and publication status to be verified.]</w:t>
+        <w:t>Bergemann D, Bonatti A, Smolin A (2026) Menu pricing of large language models. Working paper, arXiv:2502.07736 (v2, March 2026).</w:t>
       </w:r>
     </w:p>
     <w:p>
@@ -14079,7 +14065,7 @@
           <w:b w:val="0"/>
           <w:i w:val="0"/>
         </w:rPr>
-        <w:t xml:space="preserve"> 15(1):3–21. [Details to be verified.]</w:t>
+        <w:t xml:space="preserve"> 15(1):3–21.</w:t>
       </w:r>
     </w:p>
     <w:p>
@@ -14092,7 +14078,21 @@
           <w:b w:val="0"/>
           <w:i w:val="0"/>
         </w:rPr>
-        <w:t>Chowdhury NJ, et al. (2024) Introducing SWE-bench Verified. Technical report, OpenAI. [Details to be verified.]</w:t>
+        <w:t xml:space="preserve">Goel AL, Okumoto K (1979) Time-dependent error-detection rate model for software reliability and other performance measures. </w:t>
+      </w:r>
+      <w:r>
+        <w:rPr>
+          <w:b w:val="0"/>
+          <w:i/>
+        </w:rPr>
+        <w:t>IEEE Trans. Reliability</w:t>
+      </w:r>
+      <w:r>
+        <w:rPr>
+          <w:b w:val="0"/>
+          <w:i w:val="0"/>
+        </w:rPr>
+        <w:t xml:space="preserve"> R-28(3):206–211.</w:t>
       </w:r>
     </w:p>
     <w:p>
@@ -14105,21 +14105,21 @@
           <w:b w:val="0"/>
           <w:i w:val="0"/>
         </w:rPr>
-        <w:t xml:space="preserve">Goel AL, Okumoto K (1979) Time-dependent error-detection rate model for software reliability and other performance measures. </w:t>
-      </w:r>
-      <w:r>
-        <w:rPr>
-          <w:b w:val="0"/>
-          <w:i/>
-        </w:rPr>
-        <w:t>IEEE Trans. Reliability</w:t>
-      </w:r>
-      <w:r>
-        <w:rPr>
-          <w:b w:val="0"/>
-          <w:i w:val="0"/>
-        </w:rPr>
-        <w:t xml:space="preserve"> R-28(3):206–211.</w:t>
+        <w:t xml:space="preserve">He H, Miller C, Agarwal S, Kästner C, Vasilescu B (2026) Speed at the cost of quality: How Cursor AI increases short-term velocity and long-term complexity in open-source projects. </w:t>
+      </w:r>
+      <w:r>
+        <w:rPr>
+          <w:b w:val="0"/>
+          <w:i/>
+        </w:rPr>
+        <w:t>Proc. 23rd Internat. Conf. Mining Software Repositories (MSR '26)</w:t>
+      </w:r>
+      <w:r>
+        <w:rPr>
+          <w:b w:val="0"/>
+          <w:i w:val="0"/>
+        </w:rPr>
+        <w:t>, arXiv:2511.04427.</w:t>
       </w:r>
     </w:p>
     <w:p>
@@ -14132,7 +14132,21 @@
           <w:b w:val="0"/>
           <w:i w:val="0"/>
         </w:rPr>
-        <w:t>He H, et al. (2026) Cursor adoption and software development outcomes: Evidence from open-source repositories. Working paper, arXiv:2511.04427. [Title and author list to be verified.]</w:t>
+        <w:t xml:space="preserve">Ji Y, Mookerjee VS, Sethi SP (2005) Optimal software development: A control theoretic approach. </w:t>
+      </w:r>
+      <w:r>
+        <w:rPr>
+          <w:b w:val="0"/>
+          <w:i/>
+        </w:rPr>
+        <w:t>Inform. Systems Res.</w:t>
+      </w:r>
+      <w:r>
+        <w:rPr>
+          <w:b w:val="0"/>
+          <w:i w:val="0"/>
+        </w:rPr>
+        <w:t xml:space="preserve"> 16(3):292–306.</w:t>
       </w:r>
     </w:p>
     <w:p>
@@ -14145,21 +14159,14 @@
           <w:b w:val="0"/>
           <w:i w:val="0"/>
         </w:rPr>
-        <w:t xml:space="preserve">Ji Y, Mookerjee VS, Sethi SP (2005) Optimal software development: A control theoretic approach. </w:t>
-      </w:r>
-      <w:r>
-        <w:rPr>
-          <w:b w:val="0"/>
-          <w:i/>
-        </w:rPr>
-        <w:t>Inform. Systems Res.</w:t>
-      </w:r>
-      <w:r>
-        <w:rPr>
-          <w:b w:val="0"/>
-          <w:i w:val="0"/>
-        </w:rPr>
-        <w:t xml:space="preserve"> 16(3):292–306.</w:t>
+        <w:t xml:space="preserve">Jimenez CE, Yang J, Wettig A, Yao S, Pei K, Press O, Narasimhan K (2024) SWE-bench: Can language models resolve real-world GitHub issues? </w:t>
+      </w:r>
+      <w:r>
+        <w:rPr>
+          <w:b w:val="0"/>
+          <w:i/>
+        </w:rPr>
+        <w:t>Proc. Internat. Conf. Learn. Representations (ICLR 2024).</w:t>
       </w:r>
     </w:p>
     <w:p>
@@ -14172,14 +14179,7 @@
           <w:b w:val="0"/>
           <w:i w:val="0"/>
         </w:rPr>
-        <w:t xml:space="preserve">Jimenez CE, Yang J, Wettig A, Yao S, Pei K, Press O, Narasimhan K (2024) SWE-bench: Can language models resolve real-world GitHub issues? </w:t>
-      </w:r>
-      <w:r>
-        <w:rPr>
-          <w:b w:val="0"/>
-          <w:i/>
-        </w:rPr>
-        <w:t>Proc. Internat. Conf. Learn. Representations (ICLR 2024).</w:t>
+        <w:t>Koren M, Bárány Z, Wohak U (2026) The directions of technical change. Working paper, arXiv:2602.12958.</w:t>
       </w:r>
     </w:p>
     <w:p>
@@ -14192,7 +14192,21 @@
           <w:b w:val="0"/>
           <w:i w:val="0"/>
         </w:rPr>
-        <w:t>Koren M, Bárány Z, Wohak [initials] (2026) [Title to be verified.] Working paper, arXiv:2602.12958.</w:t>
+        <w:t xml:space="preserve">Milgrom P, Shannon C (1994) Monotone comparative statics. </w:t>
+      </w:r>
+      <w:r>
+        <w:rPr>
+          <w:b w:val="0"/>
+          <w:i/>
+        </w:rPr>
+        <w:t>Econometrica</w:t>
+      </w:r>
+      <w:r>
+        <w:rPr>
+          <w:b w:val="0"/>
+          <w:i w:val="0"/>
+        </w:rPr>
+        <w:t xml:space="preserve"> 62(1):157–180.</w:t>
       </w:r>
     </w:p>
     <w:p>
@@ -14205,21 +14219,14 @@
           <w:b w:val="0"/>
           <w:i w:val="0"/>
         </w:rPr>
-        <w:t xml:space="preserve">Milgrom P, Shannon C (1994) Monotone comparative statics. </w:t>
-      </w:r>
-      <w:r>
-        <w:rPr>
-          <w:b w:val="0"/>
-          <w:i/>
-        </w:rPr>
-        <w:t>Econometrica</w:t>
-      </w:r>
-      <w:r>
-        <w:rPr>
-          <w:b w:val="0"/>
-          <w:i w:val="0"/>
-        </w:rPr>
-        <w:t xml:space="preserve"> 62(1):157–180.</w:t>
+        <w:t xml:space="preserve">Montgomery L, Lüders C, Maalej W (2022) An alternative issue tracking dataset of public Jira repositories. </w:t>
+      </w:r>
+      <w:r>
+        <w:rPr>
+          <w:b w:val="0"/>
+          <w:i/>
+        </w:rPr>
+        <w:t>Proc. 19th Internat. Conf. Mining Software Repositories (MSR 2022).</w:t>
       </w:r>
     </w:p>
     <w:p>
@@ -14232,14 +14239,21 @@
           <w:b w:val="0"/>
           <w:i w:val="0"/>
         </w:rPr>
-        <w:t xml:space="preserve">Montgomery L, Lüders C, Maalej W (2022) An alternative issue tracking dataset of public Jira repositories. </w:t>
-      </w:r>
-      <w:r>
-        <w:rPr>
-          <w:b w:val="0"/>
-          <w:i/>
-        </w:rPr>
-        <w:t>Proc. 19th Internat. Conf. Mining Software Repositories (MSR 2022).</w:t>
+        <w:t xml:space="preserve">Musa JD, Okumoto K (1984) A logarithmic Poisson execution time model for software reliability measurement. </w:t>
+      </w:r>
+      <w:r>
+        <w:rPr>
+          <w:b w:val="0"/>
+          <w:i/>
+        </w:rPr>
+        <w:t>Proc. 7th Internat. Conf. Software Engrg.</w:t>
+      </w:r>
+      <w:r>
+        <w:rPr>
+          <w:b w:val="0"/>
+          <w:i w:val="0"/>
+        </w:rPr>
+        <w:t>, 230–238.</w:t>
       </w:r>
     </w:p>
     <w:p>
@@ -14252,21 +14266,7 @@
           <w:b w:val="0"/>
           <w:i w:val="0"/>
         </w:rPr>
-        <w:t xml:space="preserve">Musa JD, Okumoto K (1984) A logarithmic Poisson execution time model for software reliability measurement. </w:t>
-      </w:r>
-      <w:r>
-        <w:rPr>
-          <w:b w:val="0"/>
-          <w:i/>
-        </w:rPr>
-        <w:t>Proc. 7th Internat. Conf. Software Engrg.</w:t>
-      </w:r>
-      <w:r>
-        <w:rPr>
-          <w:b w:val="0"/>
-          <w:i w:val="0"/>
-        </w:rPr>
-        <w:t>, 230–238.</w:t>
+        <w:t>OpenAI (2024) Introducing SWE-bench Verified. Blog post, August 13, 2024, https://openai.com/index/introducing-swe-bench-verified/.</w:t>
       </w:r>
     </w:p>
     <w:p>
@@ -14306,7 +14306,7 @@
           <w:b w:val="0"/>
           <w:i w:val="0"/>
         </w:rPr>
-        <w:t>Sreenivas [initials], Larson [initials] (2026) Contracting for LLM delegation: Moral hazard in technology and effort choice. Working paper, arXiv:2608.18232.</w:t>
+        <w:t>Sreenivas NK, Larson K (2026) Contracting for LLM delegation: Moral hazard in technology and effort choice. Working paper, arXiv:2608.18232.</w:t>
       </w:r>
     </w:p>
     <w:p>

</xml_diff>

<commit_message>
Add Corollary 3.1 (tightness of the general exclusion bound) to manuscripts and appendices
Co-Authored-By: Claude Sonnet 5.5 <noreply@anthropic.com>
Claude-Session: https://claude.ai/code/session_01BZjJPdbxvnVxMrcgFoYMCh
</commit_message>
<xml_diff>
--- a/isr_submission/Manuscript_blinded.docx
+++ b/isr_submission/Manuscript_blinded.docx
@@ -5160,7 +5160,7 @@
           <w:b w:val="0"/>
           <w:i w:val="0"/>
         </w:rPr>
-        <w:t xml:space="preserve">The class covered includes menus, two-part tariffs, success fees (which are transfers from the firm to the vendor and so make the bound easy to satisfy), and fixed-damages warranties. Table 1 reports the stakes level beyond which the theorem guarantees human testing, for the illustrative fault pool and discovery rate. The threshold is a guaranteed bound, not the actual exclusion boundary. In the illustrations of Section 6 the actual boundary under the vendor's optimal price is much lower. For </w:t>
+        <w:t xml:space="preserve">The class covered includes menus, two-part tariffs, success fees (which are transfers from the firm to the vendor and so make the bound easy to satisfy), and fixed-damages warranties. Table 1 reports the stakes level beyond which the theorem guarantees human testing, for the illustrative fault pool and discovery rate. The threshold is a guaranteed bound, not the actual exclusion boundary for a tool of finite cost-effectiveness (see Corollary 3.1). In the illustrations of Section 6 the actual boundary under the vendor's optimal price is much lower. For </w:t>
       </w:r>
       <w:r>
         <w:rPr>
@@ -6088,6 +6088,444 @@
           <w:sz w:val="18"/>
         </w:rPr>
         <w:t xml:space="preserve"> are those of the cost of one unit of human testing time. Illustrative parameters.</w:t>
+      </w:r>
+    </w:p>
+    <w:p>
+      <w:pPr>
+        <w:spacing w:before="120" w:after="120" w:line="360" w:lineRule="auto"/>
+        <w:ind w:left="432" w:right="432"/>
+      </w:pPr>
+      <w:r>
+        <w:rPr>
+          <w:b/>
+        </w:rPr>
+        <w:t xml:space="preserve">Corollary 3.1 (tightness). </w:t>
+      </w:r>
+      <w:r>
+        <w:rPr>
+          <w:b w:val="0"/>
+          <w:i/>
+        </w:rPr>
+        <w:t xml:space="preserve">For 0 &lt; </w:t>
+      </w:r>
+      <w:r>
+        <w:rPr>
+          <w:b w:val="0"/>
+          <w:i w:val="0"/>
+        </w:rPr>
+        <w:t>A</w:t>
+      </w:r>
+      <w:r>
+        <w:rPr>
+          <w:b w:val="0"/>
+          <w:i/>
+        </w:rPr>
+        <w:t xml:space="preserve"> &lt; 1, let κ̄(</w:t>
+      </w:r>
+      <w:r>
+        <w:rPr>
+          <w:b w:val="0"/>
+          <w:i w:val="0"/>
+        </w:rPr>
+        <w:t>A</w:t>
+      </w:r>
+      <w:r>
+        <w:rPr>
+          <w:b w:val="0"/>
+          <w:i/>
+        </w:rPr>
+        <w:t xml:space="preserve">) solve </w:t>
+      </w:r>
+      <w:r>
+        <w:rPr>
+          <w:b w:val="0"/>
+          <w:i w:val="0"/>
+        </w:rPr>
+        <w:t>h</w:t>
+      </w:r>
+      <w:r>
+        <w:rPr>
+          <w:b w:val="0"/>
+          <w:i/>
+        </w:rPr>
+        <w:t xml:space="preserve">(κ̄) = </w:t>
+      </w:r>
+      <w:r>
+        <w:rPr>
+          <w:b w:val="0"/>
+          <w:i w:val="0"/>
+        </w:rPr>
+        <w:t>A</w:t>
+      </w:r>
+      <w:r>
+        <w:rPr>
+          <w:b w:val="0"/>
+          <w:i/>
+        </w:rPr>
+        <w:t>; this is the τ = 0 threshold of Proposition 3 written in the stakes index. Then the upper end κ</w:t>
+      </w:r>
+      <w:r>
+        <w:rPr>
+          <w:b w:val="0"/>
+          <w:i/>
+          <w:vertAlign w:val="superscript"/>
+        </w:rPr>
+        <w:t>*</w:t>
+      </w:r>
+      <w:r>
+        <w:rPr>
+          <w:b w:val="0"/>
+          <w:i/>
+        </w:rPr>
+        <w:t xml:space="preserve"> of the adoption window under a linear usage price satisfies κ</w:t>
+      </w:r>
+      <w:r>
+        <w:rPr>
+          <w:b w:val="0"/>
+          <w:i/>
+          <w:vertAlign w:val="superscript"/>
+        </w:rPr>
+        <w:t>*</w:t>
+      </w:r>
+      <w:r>
+        <w:rPr>
+          <w:b w:val="0"/>
+          <w:i/>
+        </w:rPr>
+        <w:t xml:space="preserve"> &lt; κ̄(</w:t>
+      </w:r>
+      <w:r>
+        <w:rPr>
+          <w:b w:val="0"/>
+          <w:i w:val="0"/>
+        </w:rPr>
+        <w:t>A</w:t>
+      </w:r>
+      <w:r>
+        <w:rPr>
+          <w:b w:val="0"/>
+          <w:i/>
+        </w:rPr>
+        <w:t>) for every finite ρ, and κ</w:t>
+      </w:r>
+      <w:r>
+        <w:rPr>
+          <w:b w:val="0"/>
+          <w:i/>
+          <w:vertAlign w:val="superscript"/>
+        </w:rPr>
+        <w:t>*</w:t>
+      </w:r>
+      <w:r>
+        <w:rPr>
+          <w:b w:val="0"/>
+          <w:i/>
+        </w:rPr>
+        <w:t xml:space="preserve"> ↑ κ̄(</w:t>
+      </w:r>
+      <w:r>
+        <w:rPr>
+          <w:b w:val="0"/>
+          <w:i w:val="0"/>
+        </w:rPr>
+        <w:t>A</w:t>
+      </w:r>
+      <w:r>
+        <w:rPr>
+          <w:b w:val="0"/>
+          <w:i/>
+        </w:rPr>
+        <w:t xml:space="preserve">) as ρ → ∞, for example as the speed ratio </w:t>
+      </w:r>
+      <w:r>
+        <w:rPr>
+          <w:b w:val="0"/>
+          <w:i w:val="0"/>
+        </w:rPr>
+        <w:t>B</w:t>
+      </w:r>
+      <w:r>
+        <w:rPr>
+          <w:b w:val="0"/>
+          <w:i/>
+        </w:rPr>
+        <w:t xml:space="preserve"> → ∞ at a fixed nonnegative price.</w:t>
+      </w:r>
+    </w:p>
+    <w:p>
+      <w:pPr>
+        <w:spacing w:after="120"/>
+        <w:ind w:firstLine="720"/>
+      </w:pPr>
+      <w:r>
+        <w:rPr>
+          <w:i/>
+        </w:rPr>
+        <w:t xml:space="preserve">Proof. </w:t>
+      </w:r>
+      <w:r>
+        <w:rPr>
+          <w:b w:val="0"/>
+          <w:i w:val="0"/>
+        </w:rPr>
+        <w:t>At κ</w:t>
+      </w:r>
+      <w:r>
+        <w:rPr>
+          <w:b w:val="0"/>
+          <w:i w:val="0"/>
+          <w:vertAlign w:val="superscript"/>
+        </w:rPr>
+        <w:t>*</w:t>
+      </w:r>
+      <w:r>
+        <w:rPr>
+          <w:b w:val="0"/>
+          <w:i w:val="0"/>
+        </w:rPr>
+        <w:t xml:space="preserve">, </w:t>
+      </w:r>
+      <w:r>
+        <w:rPr>
+          <w:b w:val="0"/>
+          <w:i/>
+        </w:rPr>
+        <w:t>h</w:t>
+      </w:r>
+      <w:r>
+        <w:rPr>
+          <w:b w:val="0"/>
+          <w:i w:val="0"/>
+        </w:rPr>
+        <w:t>(κ</w:t>
+      </w:r>
+      <w:r>
+        <w:rPr>
+          <w:b w:val="0"/>
+          <w:i w:val="0"/>
+          <w:vertAlign w:val="superscript"/>
+        </w:rPr>
+        <w:t>*</w:t>
+      </w:r>
+      <w:r>
+        <w:rPr>
+          <w:b w:val="0"/>
+          <w:i w:val="0"/>
+        </w:rPr>
+        <w:t xml:space="preserve">) = </w:t>
+      </w:r>
+      <w:r>
+        <w:rPr>
+          <w:b w:val="0"/>
+          <w:i/>
+        </w:rPr>
+        <w:t>A h</w:t>
+      </w:r>
+      <w:r>
+        <w:rPr>
+          <w:b w:val="0"/>
+          <w:i w:val="0"/>
+        </w:rPr>
+        <w:t>(ρκ</w:t>
+      </w:r>
+      <w:r>
+        <w:rPr>
+          <w:b w:val="0"/>
+          <w:i w:val="0"/>
+          <w:vertAlign w:val="superscript"/>
+        </w:rPr>
+        <w:t>*</w:t>
+      </w:r>
+      <w:r>
+        <w:rPr>
+          <w:b w:val="0"/>
+          <w:i w:val="0"/>
+        </w:rPr>
+        <w:t xml:space="preserve">) &lt; </w:t>
+      </w:r>
+      <w:r>
+        <w:rPr>
+          <w:b w:val="0"/>
+          <w:i/>
+        </w:rPr>
+        <w:t>A</w:t>
+      </w:r>
+      <w:r>
+        <w:rPr>
+          <w:b w:val="0"/>
+          <w:i w:val="0"/>
+        </w:rPr>
+        <w:t xml:space="preserve"> because </w:t>
+      </w:r>
+      <w:r>
+        <w:rPr>
+          <w:b w:val="0"/>
+          <w:i/>
+        </w:rPr>
+        <w:t>h</w:t>
+      </w:r>
+      <w:r>
+        <w:rPr>
+          <w:b w:val="0"/>
+          <w:i w:val="0"/>
+        </w:rPr>
+        <w:t xml:space="preserve"> &lt; 1, and </w:t>
+      </w:r>
+      <w:r>
+        <w:rPr>
+          <w:b w:val="0"/>
+          <w:i/>
+        </w:rPr>
+        <w:t>h</w:t>
+      </w:r>
+      <w:r>
+        <w:rPr>
+          <w:b w:val="0"/>
+          <w:i w:val="0"/>
+        </w:rPr>
+        <w:t xml:space="preserve"> is increasing above 1, so κ</w:t>
+      </w:r>
+      <w:r>
+        <w:rPr>
+          <w:b w:val="0"/>
+          <w:i w:val="0"/>
+          <w:vertAlign w:val="superscript"/>
+        </w:rPr>
+        <w:t>*</w:t>
+      </w:r>
+      <w:r>
+        <w:rPr>
+          <w:b w:val="0"/>
+          <w:i w:val="0"/>
+        </w:rPr>
+        <w:t xml:space="preserve"> &lt; κ̄. For any κ &lt; κ̄ we have </w:t>
+      </w:r>
+      <w:r>
+        <w:rPr>
+          <w:b w:val="0"/>
+          <w:i/>
+        </w:rPr>
+        <w:t>h</w:t>
+      </w:r>
+      <w:r>
+        <w:rPr>
+          <w:b w:val="0"/>
+          <w:i w:val="0"/>
+        </w:rPr>
+        <w:t xml:space="preserve">(κ) &lt; </w:t>
+      </w:r>
+      <w:r>
+        <w:rPr>
+          <w:b w:val="0"/>
+          <w:i/>
+        </w:rPr>
+        <w:t>A</w:t>
+      </w:r>
+      <w:r>
+        <w:rPr>
+          <w:b w:val="0"/>
+          <w:i w:val="0"/>
+        </w:rPr>
+        <w:t xml:space="preserve">, while </w:t>
+      </w:r>
+      <w:r>
+        <w:rPr>
+          <w:b w:val="0"/>
+          <w:i/>
+        </w:rPr>
+        <w:t>A h</w:t>
+      </w:r>
+      <w:r>
+        <w:rPr>
+          <w:b w:val="0"/>
+          <w:i w:val="0"/>
+        </w:rPr>
+        <w:t xml:space="preserve">(ρκ) → </w:t>
+      </w:r>
+      <w:r>
+        <w:rPr>
+          <w:b w:val="0"/>
+          <w:i/>
+        </w:rPr>
+        <w:t>A</w:t>
+      </w:r>
+      <w:r>
+        <w:rPr>
+          <w:b w:val="0"/>
+          <w:i w:val="0"/>
+        </w:rPr>
+        <w:t xml:space="preserve"> as ρ → ∞, so Φ(κ) &gt; 0 for large ρ and hence κ</w:t>
+      </w:r>
+      <w:r>
+        <w:rPr>
+          <w:b w:val="0"/>
+          <w:i w:val="0"/>
+          <w:vertAlign w:val="superscript"/>
+        </w:rPr>
+        <w:t>*</w:t>
+      </w:r>
+      <w:r>
+        <w:rPr>
+          <w:b w:val="0"/>
+          <w:i w:val="0"/>
+        </w:rPr>
+        <w:t xml:space="preserve"> &gt; κ. Therefore κ</w:t>
+      </w:r>
+      <w:r>
+        <w:rPr>
+          <w:b w:val="0"/>
+          <w:i w:val="0"/>
+          <w:vertAlign w:val="superscript"/>
+        </w:rPr>
+        <w:t>*</w:t>
+      </w:r>
+      <w:r>
+        <w:rPr>
+          <w:b w:val="0"/>
+          <w:i w:val="0"/>
+        </w:rPr>
+        <w:t xml:space="preserve"> → κ̄. Substituting κ = </w:t>
+      </w:r>
+      <w:r>
+        <w:rPr>
+          <w:b w:val="0"/>
+          <w:i/>
+        </w:rPr>
+        <w:t>abf</w:t>
+      </w:r>
+      <w:r>
+        <w:rPr>
+          <w:b w:val="0"/>
+          <w:i w:val="0"/>
+        </w:rPr>
+        <w:t xml:space="preserve"> gives (1 − </w:t>
+      </w:r>
+      <w:r>
+        <w:rPr>
+          <w:b w:val="0"/>
+          <w:i/>
+        </w:rPr>
+        <w:t>A</w:t>
+      </w:r>
+      <w:r>
+        <w:rPr>
+          <w:b w:val="0"/>
+          <w:i w:val="0"/>
+        </w:rPr>
+        <w:t>)κ̄ = 1 + ln κ̄, which is the equation of Proposition 3 with τ = 0. ∎</w:t>
+      </w:r>
+    </w:p>
+    <w:p>
+      <w:pPr>
+        <w:spacing w:after="0" w:before="0"/>
+        <w:ind w:firstLine="720"/>
+      </w:pPr>
+      <w:r>
+        <w:rPr>
+          <w:b w:val="0"/>
+          <w:i w:val="0"/>
+        </w:rPr>
+        <w:t>Proposition 3 with τ = 0 is therefore the exact exclusion boundary in the limit of an arbitrarily cheap or fast tool, and an upper bound on the boundary otherwise.</w:t>
       </w:r>
     </w:p>
     <w:p>

</xml_diff>